<commit_message>
Correct unit testing steps to the on-screen copy.
Co-authored-by: Gian Andrei Buan <buangp@students.nu-lipa.edu.ph>
</commit_message>
<xml_diff>
--- a/docs/Unit Testing (App) - Updated.docx
+++ b/docs/Unit Testing (App) - Updated.docx
@@ -368,17 +368,17 @@
           </w:tcPr>
           <w:p>
             <w:pPr>
-              <w:spacing w:before="0" w:after="0" w:line="240" w:lineRule="auto"/>
-              <w:jc w:val="left"/>
-            </w:pPr>
-            <w:r/>
-            <w:r>
-              <w:rPr>
-                <w:rFonts w:ascii="Arial Narrow" w:hAnsi="Arial Narrow" w:cs="Arial Narrow"/>
-                <w:b w:val="0"/>
-                <w:sz w:val="18"/>
-              </w:rPr>
-              <w:t>Tap Next through the carousel, tap Login on Landing, sign in on Login, and complete OTP Verification when shown.</w:t>
+              <w:spacing w:before="0" w:after="0"/>
+              <w:jc w:val="left"/>
+            </w:pPr>
+            <w:r/>
+            <w:r>
+              <w:rPr>
+                <w:rFonts w:ascii="Arial Narrow" w:hAnsi="Arial Narrow" w:cs="Arial Narrow"/>
+                <w:b w:val="0"/>
+                <w:sz w:val="16"/>
+              </w:rPr>
+              <w:t>Tap Next through the carousel until Create an Account appears, tap Login, sign in on Login, and complete OTP Verification when shown.</w:t>
             </w:r>
           </w:p>
         </w:tc>
@@ -411,17 +411,17 @@
           </w:tcPr>
           <w:p>
             <w:pPr>
-              <w:spacing w:before="0" w:after="0" w:line="240" w:lineRule="auto"/>
-              <w:jc w:val="left"/>
-            </w:pPr>
-            <w:r/>
-            <w:r>
-              <w:rPr>
-                <w:rFonts w:ascii="Arial Narrow" w:hAnsi="Arial Narrow" w:cs="Arial Narrow"/>
-                <w:b w:val="0"/>
-                <w:sz w:val="16"/>
-              </w:rPr>
-              <w:t>1. On the onboarding carousel, tap Next until Landing appears, then tap Login.</w:t>
+              <w:spacing w:before="0" w:after="0"/>
+              <w:jc w:val="left"/>
+            </w:pPr>
+            <w:r/>
+            <w:r>
+              <w:rPr>
+                <w:rFonts w:ascii="Arial Narrow" w:hAnsi="Arial Narrow" w:cs="Arial Narrow"/>
+                <w:b w:val="0"/>
+                <w:sz w:val="16"/>
+              </w:rPr>
+              <w:t>1. On the onboarding carousel, tap Next until Create an Account appears, then tap Login.</w:t>
               <w:br/>
               <w:t>2. On Login, enter Email Address and Password, then tap Login.</w:t>
               <w:br/>
@@ -5953,17 +5953,17 @@
           </w:tcPr>
           <w:p>
             <w:pPr>
-              <w:spacing w:before="0" w:after="0" w:line="240" w:lineRule="auto"/>
-              <w:jc w:val="left"/>
-            </w:pPr>
-            <w:r/>
-            <w:r>
-              <w:rPr>
-                <w:rFonts w:ascii="Arial Narrow" w:hAnsi="Arial Narrow" w:cs="Arial Narrow"/>
-                <w:b w:val="0"/>
-                <w:sz w:val="16"/>
-              </w:rPr>
-              <w:t>Zero quantity</w:t>
+              <w:spacing w:before="0" w:after="0"/>
+              <w:jc w:val="left"/>
+            </w:pPr>
+            <w:r/>
+            <w:r>
+              <w:rPr>
+                <w:rFonts w:ascii="Arial Narrow" w:hAnsi="Arial Narrow" w:cs="Arial Narrow"/>
+                <w:b w:val="0"/>
+                <w:sz w:val="16"/>
+              </w:rPr>
+              <w:t>No work ticked</w:t>
             </w:r>
           </w:p>
         </w:tc>
@@ -5973,17 +5973,17 @@
           </w:tcPr>
           <w:p>
             <w:pPr>
-              <w:spacing w:before="0" w:after="0" w:line="240" w:lineRule="auto"/>
-              <w:jc w:val="left"/>
-            </w:pPr>
-            <w:r/>
-            <w:r>
-              <w:rPr>
-                <w:rFonts w:ascii="Arial Narrow" w:hAnsi="Arial Narrow" w:cs="Arial Narrow"/>
-                <w:b w:val="0"/>
-                <w:sz w:val="16"/>
-              </w:rPr>
-              <w:t>Set a material quantity to 0, tap Estimate Now</w:t>
+              <w:spacing w:before="0" w:after="0"/>
+              <w:jc w:val="left"/>
+            </w:pPr>
+            <w:r/>
+            <w:r>
+              <w:rPr>
+                <w:rFonts w:ascii="Arial Narrow" w:hAnsi="Arial Narrow" w:cs="Arial Narrow"/>
+                <w:b w:val="0"/>
+                <w:sz w:val="16"/>
+              </w:rPr>
+              <w:t>Untick every item on What Work Is Included?</w:t>
             </w:r>
           </w:p>
         </w:tc>
@@ -5993,17 +5993,17 @@
           </w:tcPr>
           <w:p>
             <w:pPr>
-              <w:spacing w:before="0" w:after="0" w:line="240" w:lineRule="auto"/>
-              <w:jc w:val="left"/>
-            </w:pPr>
-            <w:r/>
-            <w:r>
-              <w:rPr>
-                <w:rFonts w:ascii="Arial Narrow" w:hAnsi="Arial Narrow" w:cs="Arial Narrow"/>
-                <w:b w:val="0"/>
-                <w:sz w:val="16"/>
-              </w:rPr>
-              <w:t>Every line needs a quantity greater than 0 before you can estimate.</w:t>
+              <w:spacing w:before="0" w:after="0"/>
+              <w:jc w:val="left"/>
+            </w:pPr>
+            <w:r/>
+            <w:r>
+              <w:rPr>
+                <w:rFonts w:ascii="Arial Narrow" w:hAnsi="Arial Narrow" w:cs="Arial Narrow"/>
+                <w:b w:val="0"/>
+                <w:sz w:val="16"/>
+              </w:rPr>
+              <w:t>Tick at least one piece of work to continue.</w:t>
             </w:r>
           </w:p>
         </w:tc>
@@ -7205,7 +7205,7 @@
           </w:tcPr>
           <w:p>
             <w:pPr>
-              <w:spacing w:before="0" w:after="0" w:line="240" w:lineRule="auto"/>
+              <w:spacing w:before="0" w:after="0"/>
               <w:jc w:val="left"/>
             </w:pPr>
             <w:r/>
@@ -7225,17 +7225,17 @@
           </w:tcPr>
           <w:p>
             <w:pPr>
-              <w:spacing w:before="0" w:after="0" w:line="240" w:lineRule="auto"/>
-              <w:jc w:val="left"/>
-            </w:pPr>
-            <w:r/>
-            <w:r>
-              <w:rPr>
-                <w:rFonts w:ascii="Arial Narrow" w:hAnsi="Arial Narrow" w:cs="Arial Narrow"/>
-                <w:b w:val="0"/>
-                <w:sz w:val="16"/>
-              </w:rPr>
-              <w:t>Request Supplier Quotations with no materials</w:t>
+              <w:spacing w:before="0" w:after="0"/>
+              <w:jc w:val="left"/>
+            </w:pPr>
+            <w:r/>
+            <w:r>
+              <w:rPr>
+                <w:rFonts w:ascii="Arial Narrow" w:hAnsi="Arial Narrow" w:cs="Arial Narrow"/>
+                <w:b w:val="0"/>
+                <w:sz w:val="16"/>
+              </w:rPr>
+              <w:t>Review Bill of Materials with no materials</w:t>
             </w:r>
           </w:p>
         </w:tc>
@@ -7245,17 +7245,17 @@
           </w:tcPr>
           <w:p>
             <w:pPr>
-              <w:spacing w:before="0" w:after="0" w:line="240" w:lineRule="auto"/>
-              <w:jc w:val="left"/>
-            </w:pPr>
-            <w:r/>
-            <w:r>
-              <w:rPr>
-                <w:rFonts w:ascii="Arial Narrow" w:hAnsi="Arial Narrow" w:cs="Arial Narrow"/>
-                <w:b w:val="0"/>
-                <w:sz w:val="16"/>
-              </w:rPr>
-              <w:t>Cannot post a project without materials</w:t>
+              <w:spacing w:before="0" w:after="0"/>
+              <w:jc w:val="left"/>
+            </w:pPr>
+            <w:r/>
+            <w:r>
+              <w:rPr>
+                <w:rFonts w:ascii="Arial Narrow" w:hAnsi="Arial Narrow" w:cs="Arial Narrow"/>
+                <w:b w:val="0"/>
+                <w:sz w:val="16"/>
+              </w:rPr>
+              <w:t>No materials in this plan yet. Go back and load a template or AI BOM.</w:t>
             </w:r>
           </w:p>
         </w:tc>
@@ -9830,17 +9830,17 @@
           </w:tcPr>
           <w:p>
             <w:pPr>
-              <w:spacing w:before="0" w:after="0" w:line="240" w:lineRule="auto"/>
-              <w:jc w:val="left"/>
-            </w:pPr>
-            <w:r/>
-            <w:r>
-              <w:rPr>
-                <w:rFonts w:ascii="Arial Narrow" w:hAnsi="Arial Narrow" w:cs="Arial Narrow"/>
-                <w:b w:val="0"/>
-                <w:sz w:val="16"/>
-              </w:rPr>
-              <w:t>Empty BOM post from estimator</w:t>
+              <w:spacing w:before="0" w:after="0"/>
+              <w:jc w:val="left"/>
+            </w:pPr>
+            <w:r/>
+            <w:r>
+              <w:rPr>
+                <w:rFonts w:ascii="Arial Narrow" w:hAnsi="Arial Narrow" w:cs="Arial Narrow"/>
+                <w:b w:val="0"/>
+                <w:sz w:val="16"/>
+              </w:rPr>
+              <w:t>Empty BOM on estimator</w:t>
             </w:r>
           </w:p>
         </w:tc>
@@ -9850,17 +9850,17 @@
           </w:tcPr>
           <w:p>
             <w:pPr>
-              <w:spacing w:before="0" w:after="0" w:line="240" w:lineRule="auto"/>
-              <w:jc w:val="left"/>
-            </w:pPr>
-            <w:r/>
-            <w:r>
-              <w:rPr>
-                <w:rFonts w:ascii="Arial Narrow" w:hAnsi="Arial Narrow" w:cs="Arial Narrow"/>
-                <w:b w:val="0"/>
-                <w:sz w:val="16"/>
-              </w:rPr>
-              <w:t>Request Supplier Quotations with no materials</w:t>
+              <w:spacing w:before="0" w:after="0"/>
+              <w:jc w:val="left"/>
+            </w:pPr>
+            <w:r/>
+            <w:r>
+              <w:rPr>
+                <w:rFonts w:ascii="Arial Narrow" w:hAnsi="Arial Narrow" w:cs="Arial Narrow"/>
+                <w:b w:val="0"/>
+                <w:sz w:val="16"/>
+              </w:rPr>
+              <w:t>Review Bill of Materials with no materials</w:t>
             </w:r>
           </w:p>
         </w:tc>
@@ -9870,17 +9870,17 @@
           </w:tcPr>
           <w:p>
             <w:pPr>
-              <w:spacing w:before="0" w:after="0" w:line="240" w:lineRule="auto"/>
-              <w:jc w:val="left"/>
-            </w:pPr>
-            <w:r/>
-            <w:r>
-              <w:rPr>
-                <w:rFonts w:ascii="Arial Narrow" w:hAnsi="Arial Narrow" w:cs="Arial Narrow"/>
-                <w:b w:val="0"/>
-                <w:sz w:val="16"/>
-              </w:rPr>
-              <w:t>Cannot post a project without materials</w:t>
+              <w:spacing w:before="0" w:after="0"/>
+              <w:jc w:val="left"/>
+            </w:pPr>
+            <w:r/>
+            <w:r>
+              <w:rPr>
+                <w:rFonts w:ascii="Arial Narrow" w:hAnsi="Arial Narrow" w:cs="Arial Narrow"/>
+                <w:b w:val="0"/>
+                <w:sz w:val="16"/>
+              </w:rPr>
+              <w:t>No materials in this plan yet. Go back and load a template or AI BOM.</w:t>
             </w:r>
           </w:p>
         </w:tc>

</xml_diff>

<commit_message>
Name the registration screen Create an Account in the unit tests.
Co-authored-by: Gian Andrei Buan <buangp@students.nu-lipa.edu.ph>
</commit_message>
<xml_diff>
--- a/docs/Unit Testing (App) - Updated.docx
+++ b/docs/Unit Testing (App) - Updated.docx
@@ -1577,17 +1577,17 @@
           </w:tcPr>
           <w:p>
             <w:pPr>
-              <w:spacing w:before="0" w:after="0" w:line="240" w:lineRule="auto"/>
-              <w:jc w:val="left"/>
-            </w:pPr>
-            <w:r/>
-            <w:r>
-              <w:rPr>
-                <w:rFonts w:ascii="Arial Narrow" w:hAnsi="Arial Narrow" w:cs="Arial Narrow"/>
-                <w:b w:val="0"/>
-                <w:sz w:val="18"/>
-              </w:rPr>
-              <w:t>Landing is open. Device is online. Tester has a new email inbox.</w:t>
+              <w:spacing w:before="0" w:after="0"/>
+              <w:jc w:val="left"/>
+            </w:pPr>
+            <w:r/>
+            <w:r>
+              <w:rPr>
+                <w:rFonts w:ascii="Arial Narrow" w:hAnsi="Arial Narrow" w:cs="Arial Narrow"/>
+                <w:b w:val="0"/>
+                <w:sz w:val="16"/>
+              </w:rPr>
+              <w:t>Create an Account is open. Device is online. Tester has a new email inbox.</w:t>
             </w:r>
           </w:p>
         </w:tc>
@@ -1663,17 +1663,17 @@
           </w:tcPr>
           <w:p>
             <w:pPr>
-              <w:spacing w:before="0" w:after="0" w:line="240" w:lineRule="auto"/>
-              <w:jc w:val="left"/>
-            </w:pPr>
-            <w:r/>
-            <w:r>
-              <w:rPr>
-                <w:rFonts w:ascii="Arial Narrow" w:hAnsi="Arial Narrow" w:cs="Arial Narrow"/>
-                <w:b w:val="0"/>
-                <w:sz w:val="16"/>
-              </w:rPr>
-              <w:t>1. On Landing, tap Get Started to open Register.</w:t>
+              <w:spacing w:before="0" w:after="0"/>
+              <w:jc w:val="left"/>
+            </w:pPr>
+            <w:r/>
+            <w:r>
+              <w:rPr>
+                <w:rFonts w:ascii="Arial Narrow" w:hAnsi="Arial Narrow" w:cs="Arial Narrow"/>
+                <w:b w:val="0"/>
+                <w:sz w:val="16"/>
+              </w:rPr>
+              <w:t>1. On Create an Account, tap Get Started to open Register.</w:t>
               <w:br/>
               <w:t>2. Fill First Name, Last Name, Email, Password, and Confirm Password.</w:t>
               <w:br/>

</xml_diff>